<commit_message>
Apply annual prioritized FuelEU energy allocation and optimize source boundaries
</commit_message>
<xml_diff>
--- a/docs/Maritime_Carbon_Analyst_Guide.docx
+++ b/docs/Maritime_Carbon_Analyst_Guide.docx
@@ -29,7 +29,7 @@
         <w:rPr>
           <w:sz w:val="20"/>
         </w:rPr>
-        <w:t>Review draft · Desktop application · Engine 6.5.2 · 9 September 2026</w:t>
+        <w:t>Review draft · Desktop application · Engine 6.6.0 · 10 September 2026</w:t>
       </w:r>
     </w:p>
     <w:p>
@@ -386,7 +386,7 @@
     </w:p>
     <w:p>
       <w:r>
-        <w:t>Confirm scope only after reviewing the actual routes and applicability for both regimes. The app uses the same ordinary-EU category weights for FuelEU and ETS: 100% for intra-EU sea and EU berth, 50% for EU/non-EU sea and 0% for outside-scope sea and non-EU berth. The confirmation records your review; it does not investigate port calls or resolve exceptions automatically.</w:t>
+        <w:t>Confirm scope only after reviewing the actual routes and applicability for both regimes. The app uses ordinary-EU category weights to determine ETS scope and the FuelEU covered energy total: 100% for intra-EU sea and EU berth, 50% for EU/non-EU sea and 0% for outside-scope sea and non-EU berth. FuelEU then attributes eligible annual energy in lowest-WtW order. The confirmation records your review; it does not investigate port calls or resolve exceptions automatically.</w:t>
       </w:r>
     </w:p>
     <w:p>
@@ -482,7 +482,7 @@
         <w:pStyle w:val="ListBullet"/>
       </w:pPr>
       <w:r>
-        <w:t>EU/non-EU sea voyage: enter the full physical tonnes, not half. The app applies the 50% regulatory weight itself.</w:t>
+        <w:t>EU/non-EU sea voyage: enter the full physical tonnes, not half. The app applies 50% to ETS scope and the FuelEU covered energy total, while the full eligible fuel energy is available for prioritized FuelEU attribution.</w:t>
       </w:r>
     </w:p>
     <w:p>
@@ -555,7 +555,7 @@
         <w:pStyle w:val="Heading2"/>
       </w:pPr>
       <w:r>
-        <w:t>4.6 Legacy fields and CSV import</w:t>
+        <w:t>4.6 Excel import and legacy CSV fields</w:t>
       </w:r>
     </w:p>
     <w:p>
@@ -565,7 +565,22 @@
     </w:p>
     <w:p>
       <w:r>
-        <w:t>Download the current CSV fleet template and preserve its exact headers. The import accepts UTF-8, at most 64 KB and at most 20 vessels per file, subject to the company's total vessel limit. It adds vessels rather than replacing the existing fleet. The template carries basic identity, one current fuel, sea and berth tonnes, scope percentages, alternative and maximum share. It does not replace the detailed voyage-row editor or record the complete technical/evidence review. Review every imported vessel before calculation.</w:t>
+        <w:t>Download the Excel fleet template from Import vessels. Fill Vessels with one row per ship and a unique vessel_id. Fill Consumption with one row per vessel, voyage, category and current fuel, repeating the exact vessel_id to link the rows. Enter full annual physical tonnes; do not halve EU/non-EU quantities. The app applies coverage itself. MGO is the MGO / LSMGO entry; LSMGO is also accepted on import. Percentages are numbers from 0 to 100: enter 30 for 30%. Leave the shore-power share blank or zero when no OPS replacement is planned, and always for non-EU-berth categories.</w:t>
+      </w:r>
+    </w:p>
+    <w:p>
+      <w:r>
+        <w:t>The workbook contains detailed Instructions, field comments, drop-down lists and a separate Example sheet. Only Vessels and Consumption are imported. Both input sheets start blank; copy the example only if you want to try it. Preserve the sheet names and exact headers in row 1. Use values only, with no formula cells, total rows or duplicate vessel/voyage/category/fuel rows. Combine duplicate quantities before upload.</w:t>
+      </w:r>
+    </w:p>
+    <w:p>
+      <w:r>
+        <w:t>Save as .xlsx, up to 2 MB. Each upload supports up to 20 vessels and 2,000 consumption rows, subject to the company's remaining vessel limit and at most 100 distinct voyage/fuel groups per ship. Import appends ships and retains the existing fleet; uploading twice adds the ships twice. Validation is all-or-nothing. Prices, years, regulatory scope, technical confirmations and fuel eligibility remain in the app. Review every imported vessel before comparison: alternative compatibility and OPS readiness start unconfirmed.</w:t>
+      </w:r>
+    </w:p>
+    <w:p>
+      <w:r>
+        <w:t>The optional row-based UTF-8 CSV supports the same voyage/leg/fuel structure, up to 512 KB, with identical vessel details repeated on every row for each vessel_id. The original 11-column CSV remains supported up to 64 KB and 20 vessels. Only that older format imports one sea fuel, sea and berth totals and voyage percentages, which can then be expanded in the vessel editor.</w:t>
       </w:r>
     </w:p>
     <w:p>
@@ -1105,7 +1120,7 @@
     </w:p>
     <w:p>
       <w:r>
-        <w:t>“Lowest evaluated” is deliberate. The search starts with a fuel-level incumbent, then varies voyage/fuel/leg allocations using sampled ranges, continuous refinement, compliance candidates and supply boundaries. It also transfers selected energy between legs. The bounded search does not guarantee the global mathematical minimum across all fleet allocations, technologies or voyage schedules.</w:t>
+        <w:t>“Lowest evaluated” is deliberate. The search starts with a fuel-level incumbent, then varies voyage/fuel/leg allocations using sampled ranges, continuous refinement, FuelEU source-exhaustion boundaries, verified compliance candidates and supply boundaries. It also transfers selected energy between legs. The bounded search does not guarantee the global mathematical minimum across all fleet allocations, technologies or voyage schedules.</w:t>
       </w:r>
     </w:p>
     <w:p>
@@ -1118,7 +1133,7 @@
     </w:p>
     <w:p>
       <w:r>
-        <w:t>Read the selected vessel, voyage and category together. A remark such as “Voyage 1 · Intra-EU sea: replace 21.876 t/year of MGO with 21.230 t/year of HVO” describes an annual same-leg substitution. It does not instruct you to spread the replacement proportionally across the vessel's other legs. The quantities repeat for each reporting year.</w:t>
+        <w:t>Read the selected vessel, voyage and category together. A remark such as “Voyage 1 · Intra-EU sea: replace 21.739 t/year of MGO with 21.096 t/year of HVO” describes an annual same-leg substitution. It does not instruct you to spread the replacement proportionally across the vessel's other legs. The quantities repeat for each reporting year.</w:t>
       </w:r>
     </w:p>
     <w:p>
@@ -1172,7 +1187,22 @@
         <w:pStyle w:val="Heading2"/>
       </w:pPr>
       <w:r>
-        <w:t>8.7 Fuel pathway, methane and RFNBO ledger</w:t>
+        <w:t>8.7 FuelEU allocation and fuel pathway ledgers</w:t>
+      </w:r>
+    </w:p>
+    <w:p>
+      <w:r>
+        <w:t>Open “FuelEU annual prioritized energy allocation” to inspect each ship’s covered energy, eligible source energy and allocated MJ. The app fills annual covered energy from lowest to highest WtW, including conventional fuels and eligible alternatives. A fuel’s full EU/non-EU sea consumption can be attributed, while only half of that leg’s total energy determines the covered amount. Attribution can span the ship’s eligible voyages and EU berth use within the same reporting year.</w:t>
+      </w:r>
+    </w:p>
+    <w:p>
+      <w:r>
+        <w:t>For example, 100 MJ on EU/non-EU voyages gives 50 MJ covered. If the eligible inventory is 20 MJ alternative at WtW 20, 15 MJ conventional A at 85, 25 MJ B at 90 and 40 MJ C at 95, attribution is 20 MJ alternative, 15 MJ A and 15 MJ B. C receives no attribution. Physical consumption and purchase costs still include all 100 MJ; ETS still applies its own proportional scope.</w:t>
+      </w:r>
+    </w:p>
+    <w:p>
+      <w:r>
+        <w:t>This is an elected FuelEU accounting method, separate from the cost-based “replace first” comparison and physical replacement instructions. It applies to current-fuel baselines too. RFNBO reward is applied after physical attribution. Outside-scope sea and non-EU berth cannot supply the inventory in this model; MRV-reported FuelEU-exempt activity needs separate assessment. Historical reports keep their saved proportional results; run a new comparison for the new method.</w:t>
       </w:r>
     </w:p>
     <w:p>
@@ -1231,7 +1261,7 @@
     </w:p>
     <w:p>
       <w:r>
-        <w:t>With these inputs, the checked regression result replaces approximately 21.875943 tonnes of MGO with 21.229608 tonnes of HVO on Voyage 1's intra-EU sea category. Total annual cost is approximately EUR 833,155.12, compared with EUR 834,499.72 for the current-fuel external-pooling option. The replacement supplies the removed energy on that same leg and closes the modelled GHG deficit without pooling. These figures are reproducibility examples, not forecasts for a real vessel.</w:t>
+        <w:t>With these inputs, the checked regression result replaces approximately 21.738698 tonnes of MGO with 21.096418 tonnes of HVO on Voyage 1's intra-EU sea category. Total annual cost is approximately EUR 833,084.91, compared with EUR 834,421.07 for the current-fuel external-pooling option. The current-fuel baseline already benefits from conventional-fuel prioritization. The replacement supplies the removed energy on that same leg and closes the modelled GHG deficit without pooling. These figures are reproducibility examples, not forecasts for a real vessel.</w:t>
       </w:r>
     </w:p>
     <w:p>
@@ -1293,7 +1323,7 @@
     </w:p>
     <w:p>
       <w:r>
-        <w:t>The CSV includes the evaluated strategies and their ship/year cost and compliance records, plus explicit company other-cost rows. Some fields contain JSON describing detailed fuel inventories and voyage-leg replacements. It is an audit-friendly export, not a flat bunkering instruction. Filter by strategy and reporting year before summing, and avoid double-counting different policy evaluations as if they were additional vessels.</w:t>
+        <w:t>The CSV includes the evaluated strategies and their ship/year cost and compliance records, plus explicit company other-cost rows. Some fields contain JSON describing detailed fuel inventories, voyage-leg replacements and annual FuelEU attribution. The allocation ledger records eligible and allocated physical MJ by fuel and consumer. It is an audit-friendly export, not a flat bunkering instruction. Filter by strategy and reporting year before summing, and avoid double-counting different policy evaluations as if they were additional vessels.</w:t>
       </w:r>
     </w:p>
     <w:p>
@@ -1409,7 +1439,7 @@
     </w:p>
     <w:p>
       <w:r>
-        <w:t>A fully covered leg can deliver more modelled compliance benefit per tonne purchased than a half-covered or outside-scope leg. Fuel price, displaced LCV/intensity, system efficiency, vessel limits and fleet settlement also influence the choice. The optimizer retains each replacement on its original leg; it does not move renewable fuel onto a covered part of a voyage merely for accounting credit.</w:t>
+        <w:t>An intra-EU leg can offer larger ETS savings, while eligible alternative energy on an EU/non-EU leg can receive full FuelEU attribution within the annual covered-energy limit. Outside-scope fuel cannot enter that inventory. Fuel price, displaced LCV/intensity, system efficiency, vessel limits and fleet settlement also influence the choice. Physical replacement stays on the chosen leg; FuelEU accounting separately prioritizes the eligible annual inventory.</w:t>
       </w:r>
     </w:p>
     <w:p>
@@ -1446,14 +1476,26 @@
     <w:p>
       <w:pPr>
         <w:pStyle w:val="Heading1"/>
+        <w:pageBreakBefore/>
       </w:pPr>
       <w:r>
         <w:t>12. References and version control</w:t>
       </w:r>
     </w:p>
     <w:p>
+      <w:pPr>
+        <w:pStyle w:val="ListBullet"/>
+      </w:pPr>
       <w:r>
-        <w:t>The following sources were consulted for the regulatory context. The guide's descriptions of field behavior, search limits, accounting sequence and exports are based on the application's engine 6.5.2, forms and release tests. Regulatory changes after the recorded ruleset date require review before use; the guide does not assert a new legal ruleset.</w:t>
+        <w:rPr>
+          <w:sz w:val="16"/>
+        </w:rPr>
+        <w:t>Commission allocation guidance: https://transport.ec.europa.eu/document/download/d4426ccc-ef46-4292-8b6d-5bf7a620f5ba_en?filename=fueleu_guidance_document_for_shipping_companies.pdf#page=51 (section 4.4, pages 51–52).</w:t>
+      </w:r>
+    </w:p>
+    <w:p>
+      <w:r>
+        <w:t>The following sources were consulted for the regulatory context. The guide's descriptions of field behavior, search limits, accounting sequence and exports are based on the application's engine 6.6.0, forms and release tests. Regulatory changes after the recorded ruleset date require review before use; the guide does not assert a new legal ruleset.</w:t>
       </w:r>
     </w:p>
     <w:p>
@@ -1533,7 +1575,7 @@
       <w:jc w:val="right"/>
     </w:pPr>
     <w:r>
-      <w:t xml:space="preserve">Review draft · Engine 6.5.2  |  </w:t>
+      <w:t xml:space="preserve">Review draft · Engine 6.6.0  |  </w:t>
     </w:r>
     <w:fldSimple w:instr="PAGE"/>
   </w:p>

</xml_diff>

<commit_message>
Correct FuelEU GWP factors and optimize RFNBO rewarded allocation
</commit_message>
<xml_diff>
--- a/docs/Maritime_Carbon_Analyst_Guide.docx
+++ b/docs/Maritime_Carbon_Analyst_Guide.docx
@@ -29,7 +29,7 @@
         <w:rPr>
           <w:sz w:val="20"/>
         </w:rPr>
-        <w:t>Review draft · Desktop application · Engine 6.6.0 · 10 September 2026</w:t>
+        <w:t>Review draft · Desktop application · Engine 6.7.0 · 10 September 2026</w:t>
       </w:r>
     </w:p>
     <w:p>
@@ -386,7 +386,7 @@
     </w:p>
     <w:p>
       <w:r>
-        <w:t>Confirm scope only after reviewing the actual routes and applicability for both regimes. The app uses ordinary-EU category weights to determine ETS scope and the FuelEU covered energy total: 100% for intra-EU sea and EU berth, 50% for EU/non-EU sea and 0% for outside-scope sea and non-EU berth. FuelEU then attributes eligible annual energy in lowest-WtW order. The confirmation records your review; it does not investigate port calls or resolve exceptions automatically.</w:t>
+        <w:t>Confirm scope only after reviewing the actual routes and applicability for both regimes. The app uses ordinary-EU category weights to determine ETS scope and the FuelEU covered energy total: 100% for intra-EU sea and EU berth, 50% for EU/non-EU sea and 0% for outside-scope sea and non-EU berth. FuelEU then attributes eligible annual energy to minimize attained intensity, including any elected RFNBO reward. The confirmation records your review; it does not investigate port calls or resolve exceptions automatically.</w:t>
       </w:r>
     </w:p>
     <w:p>
@@ -904,7 +904,7 @@
     </w:p>
     <w:p>
       <w:r>
-        <w:t>For methane and RFNBO pathways, the form uses WtT rather than a directly entered complete WtW value. The engine adds the relevant physical combustion and methane-slip contribution. Enter the certified FuelEU-adjusted WtT on the accounting basis expected by this model, including any applicable carbon-accounting adjustment. Entering a complete WtW value here would count part of the emissions twice.</w:t>
+        <w:t>For methane and RFNBO pathways, the form uses WtT rather than a directly entered complete WtW value. The engine adds the relevant physical combustion and methane-slip contribution using FuelEU CH4=25 and N2O=298. ETS calculations separately use CH4=28 and N2O=265. New-case oil defaults use the FuelEU factors; older saved complete WtW inputs remain as entered and require review before rerunning. Enter the certified FuelEU-adjusted WtT on the accounting basis expected by this model, including any applicable carbon-accounting adjustment. Entering a complete WtW value here would count part of the emissions twice.</w:t>
       </w:r>
     </w:p>
     <w:p>
@@ -1002,7 +1002,7 @@
     </w:p>
     <w:p>
       <w:r>
-        <w:t>When enabled for a qualifying RFNBO, the model doubles that fuel's eligible contribution to the intensity denominator through 2033; from 2034 the multiplier is one. It does not double physical energy, halve the fuel invoice or zero ETS gases. This is a fixed assumption, not an optimized choice. Duplicate the case with the reward disabled if you need to examine its influence.</w:t>
+        <w:t>When enabled for a qualifying RFNBO, the model doubles that fuel's eligible contribution to the intensity denominator through 2033; from 2034 the multiplier is one. It does not double physical energy, halve the fuel invoice or zero ETS gases. The reward election is fixed, while the annual allocation optimizes its denominator benefit. Duplicate the case with the reward disabled if you need to examine its influence.</w:t>
       </w:r>
     </w:p>
     <w:p>
@@ -1120,7 +1120,7 @@
     </w:p>
     <w:p>
       <w:r>
-        <w:t>“Lowest evaluated” is deliberate. The search starts with a fuel-level incumbent, then varies voyage/fuel/leg allocations using sampled ranges, continuous refinement, FuelEU source-exhaustion boundaries, verified compliance candidates and supply boundaries. It also transfers selected energy between legs. The bounded search does not guarantee the global mathematical minimum across all fleet allocations, technologies or voyage schedules.</w:t>
+        <w:t>“Lowest evaluated” is deliberate. The search starts with a fuel-level incumbent, then varies voyage/fuel/leg allocations using sampled ranges, continuous refinement, FuelEU source-exhaustion and RFNBO allocation-order boundaries, verified compliance candidates and supply boundaries. It also transfers selected energy between legs. The bounded search does not guarantee the global mathematical minimum across all fleet allocations, technologies or voyage schedules.</w:t>
       </w:r>
     </w:p>
     <w:p>
@@ -1133,7 +1133,7 @@
     </w:p>
     <w:p>
       <w:r>
-        <w:t>Read the selected vessel, voyage and category together. A remark such as “Voyage 1 · Intra-EU sea: replace 21.739 t/year of MGO with 21.096 t/year of HVO” describes an annual same-leg substitution. It does not instruct you to spread the replacement proportionally across the vessel's other legs. The quantities repeat for each reporting year.</w:t>
+        <w:t>Read the selected vessel, voyage and category together. A remark such as “Voyage 1 · Intra-EU sea: replace 23.181 t/year of MGO with 22.496 t/year of HVO” describes an annual same-leg substitution. It does not instruct you to spread the replacement proportionally across the vessel's other legs. The quantities repeat for each reporting year.</w:t>
       </w:r>
     </w:p>
     <w:p>
@@ -1192,7 +1192,7 @@
     </w:p>
     <w:p>
       <w:r>
-        <w:t>Open “FuelEU annual prioritized energy allocation” to inspect each ship’s covered energy, eligible source energy and allocated MJ. The app fills annual covered energy from lowest to highest WtW, including conventional fuels and eligible alternatives. A fuel’s full EU/non-EU sea consumption can be attributed, while only half of that leg’s total energy determines the covered amount. Attribution can span the ship’s eligible voyages and EU berth use within the same reporting year.</w:t>
+        <w:t>Open “FuelEU annual prioritized energy allocation” to inspect each ship’s covered energy, eligible source energy and allocated MJ. The app minimizes annual attained intensity, including the denominator benefit of eligible RFNBO with an elected reward. Conventional fuels retain their internal lowest-WtW priority. The ledger shows physical WtW and each source’s denominator reward. A fuel’s full EU/non-EU sea consumption can be attributed, while only half of that leg’s total energy determines the covered amount. Attribution can span the ship’s eligible voyages and EU berth use within the same reporting year.</w:t>
       </w:r>
     </w:p>
     <w:p>
@@ -1202,7 +1202,12 @@
     </w:p>
     <w:p>
       <w:r>
-        <w:t>This is an elected FuelEU accounting method, separate from the cost-based “replace first” comparison and physical replacement instructions. It applies to current-fuel baselines too. RFNBO reward is applied after physical attribution. Outside-scope sea and non-EU berth cannot supply the inventory in this model; MRV-reported FuelEU-exempt activity needs separate assessment. Historical reports keep their saved proportional results; run a new comparison for the new method.</w:t>
+        <w:t>This elected FuelEU accounting method applies to baselines and candidates. It is separate from physical replacement and the cost-based “replace first” comparison. With active RFNBO reward, allocation minimizes emissions divided by covered physical energy plus the extra RFNBO reward energy. Neither physical-WtW ordering nor WtW/reward sorting reliably minimizes this ratio. Outside-scope sea and non-EU berth are excluded; MRV-reported FuelEU-exempt activity needs separate assessment. Historical reports retain their saved method and factors; review saved fuel inputs before rerunning.</w:t>
+      </w:r>
+    </w:p>
+    <w:p>
+      <w:r>
+        <w:t>For example, with 50 MJ covered, 40 MJ biofuel at WtW 20, 20 MJ RFNBO at 25 and 40 MJ fossil at 90 available, the active reward selects 30 MJ biofuel plus 20 MJ RFNBO. Intensity is (30×20 + 20×25)/(50+20) = 15.714 gCO2e/MJ, compared with 17.5 from physical-WtW ordering. With the reward disabled or expired, lowest-WtW order applies and the intensity is 21. This allocation improves accounting for the same physical fuel inventory.</w:t>
       </w:r>
     </w:p>
     <w:p>
@@ -1261,7 +1266,7 @@
     </w:p>
     <w:p>
       <w:r>
-        <w:t>With these inputs, the checked regression result replaces approximately 21.738698 tonnes of MGO with 21.096418 tonnes of HVO on Voyage 1's intra-EU sea category. Total annual cost is approximately EUR 833,084.91, compared with EUR 834,421.07 for the current-fuel external-pooling option. The current-fuel baseline already benefits from conventional-fuel prioritization. The replacement supplies the removed energy on that same leg and closes the modelled GHG deficit without pooling. These figures are reproducibility examples, not forecasts for a real vessel.</w:t>
+        <w:t>With these inputs, the checked regression result replaces approximately 23.180978 tonnes of MGO with 22.496085 tonnes of HVO on Voyage 1's intra-EU sea category. Total annual cost is approximately EUR 833,822.73, compared with EUR 835,273.05 for the current-fuel external-pooling option. The current-fuel baseline already benefits from conventional-fuel prioritization. The replacement supplies the removed energy on that same leg and closes the modelled GHG deficit without pooling. These figures are reproducibility examples, not forecasts for a real vessel.</w:t>
       </w:r>
     </w:p>
     <w:p>
@@ -1490,12 +1495,12 @@
         <w:rPr>
           <w:sz w:val="16"/>
         </w:rPr>
-        <w:t>Commission allocation guidance: https://transport.ec.europa.eu/document/download/d4426ccc-ef46-4292-8b6d-5bf7a620f5ba_en?filename=fueleu_guidance_document_for_shipping_companies.pdf#page=51 (section 4.4, pages 51–52).</w:t>
+        <w:t>Commission allocation guidance: https://transport.ec.europa.eu/document/download/d4426ccc-ef46-4292-8b6d-5bf7a620f5ba_en?filename=fueleu_guidance_document_for_shipping_companies.pdf#page=51 (section 4.4, pages 51–52; see also section 4.3.3 for FuelEU GWP100 and section 4.3.6 for RFNBO).</w:t>
       </w:r>
     </w:p>
     <w:p>
       <w:r>
-        <w:t>The following sources were consulted for the regulatory context. The guide's descriptions of field behavior, search limits, accounting sequence and exports are based on the application's engine 6.6.0, forms and release tests. Regulatory changes after the recorded ruleset date require review before use; the guide does not assert a new legal ruleset.</w:t>
+        <w:t>The following sources were consulted for the regulatory context. The guide's descriptions of field behavior, search limits, accounting sequence and exports are based on the application's engine 6.7.0, forms and release tests. Regulatory changes after the recorded ruleset date require review before use; the guide does not assert a new legal ruleset.</w:t>
       </w:r>
     </w:p>
     <w:p>
@@ -1575,7 +1580,7 @@
       <w:jc w:val="right"/>
     </w:pPr>
     <w:r>
-      <w:t xml:space="preserve">Review draft · Engine 6.6.0  |  </w:t>
+      <w:t xml:space="preserve">Review draft · Engine 6.7.0  |  </w:t>
     </w:r>
     <w:fldSimple w:instr="PAGE"/>
   </w:p>

</xml_diff>

<commit_message>
Regenerate analyst Word guide with wind assistance instructions
</commit_message>
<xml_diff>
--- a/docs/Maritime_Carbon_Analyst_Guide.docx
+++ b/docs/Maritime_Carbon_Analyst_Guide.docx
@@ -29,7 +29,7 @@
         <w:rPr>
           <w:sz w:val="20"/>
         </w:rPr>
-        <w:t>Review draft · Desktop application · Engine 6.7.0 · 10 September 2026</w:t>
+        <w:t>Review draft · Desktop application · Engine 6.8.0 · 16 September 2026</w:t>
       </w:r>
     </w:p>
     <w:p>
@@ -61,7 +61,7 @@
     </w:p>
     <w:p>
       <w:r>
-        <w:t>Decide whether the question concerns the coming reporting year, a multi-year budget, a fuel conversion, shore power, or purchasing FuelEU surplus. Write down the common service requirement before changing fuels: the same annual voyages and transport activity must be supported in every strategy. Otherwise, an apparent saving may reflect less activity rather than a better compliance choice.</w:t>
+        <w:t>Decide whether the question concerns the coming reporting year, a multi-year budget, a fuel conversion, a wind retrofit, shore power, or purchasing FuelEU surplus. Write down the common service requirement before changing fuels: the same annual voyages and transport activity must be supported in every strategy. Otherwise, an apparent saving may reflect less activity rather than a better compliance choice.</w:t>
       </w:r>
     </w:p>
     <w:p>
@@ -104,6 +104,14 @@
       </w:pPr>
       <w:r>
         <w:t>Vessel characteristics, engine categories, blend or substitution limits, relative efficiency, pilot requirements and any conversion costs.</w:t>
+      </w:r>
+    </w:p>
+    <w:p>
+      <w:pPr>
+        <w:pStyle w:val="ListBullet"/>
+      </w:pPr>
+      <w:r>
+        <w:t>For wind: the existing-equipment or proposed-retrofit baseline, propulsion share and net saving per sea row, reviewed installation/operating costs, and separate FuelEU power evidence.</w:t>
       </w:r>
     </w:p>
     <w:p>
@@ -1484,7 +1492,191 @@
         <w:pageBreakBefore/>
       </w:pPr>
       <w:r>
-        <w:t>12. References and version control</w:t>
+        <w:t>12. Wings and wind-assisted propulsion</w:t>
+      </w:r>
+    </w:p>
+    <w:p>
+      <w:pPr>
+        <w:pStyle w:val="Heading2"/>
+      </w:pPr>
+      <w:r>
+        <w:t>12.1 Choose the correct baseline</w:t>
+      </w:r>
+    </w:p>
+    <w:p>
+      <w:r>
+        <w:t>Open the vessel editor and find Wings &amp; wind-assisted propulsion. No wind assistance leaves wind out of the calculation. Evaluate a wind retrofit allows the optimizer to select a proposed installation together with fuel switching, shore power and pooling. Existing wings means the entered consumption already includes their operational effect; the equipment remains in every strategy.</w:t>
+      </w:r>
+    </w:p>
+    <w:p>
+      <w:r>
+        <w:t>For a proposed retrofit, use annual consumption before wind savings. For existing wings, use the actual or reviewed annual consumption with wind already included, leave proposed net savings blank or zero, and enter zero new wind investment. The app does not apply a second fuel reduction or reconstruct a hypothetical no-wing baseline. Existing annual operating costs are included in the reference and all other strategies.</w:t>
+      </w:r>
+    </w:p>
+    <w:p>
+      <w:pPr>
+        <w:pStyle w:val="Heading2"/>
+      </w:pPr>
+      <w:r>
+        <w:t>12.2 Complete the two wind columns on every sea row</w:t>
+      </w:r>
+    </w:p>
+    <w:p>
+      <w:r>
+        <w:t>Propulsion share is the percentage of that row's fuel serving propulsion. Exclude hotel loads, boilers and other unaffected consumers. Net wind saving on propulsion is the assessed percentage reduction of that propulsion fuel at the same speed and transport service, after accounting for the wind equipment's auxiliary energy demand. The allowed net-saving range is 0–99%; the app does not predict performance from wing dimensions, weather or installed power.</w:t>
+      </w:r>
+    </w:p>
+    <w:p>
+      <w:r>
+        <w:t>For a proposed retrofit, both values are required on every sea row, including explicit zeros for unaffected voyages or pilot fuel that must remain. The app first multiplies the row's tonnes by propulsion share and net saving, then subtracts that amount before fuel switching. For example, 1,000 tonnes, 80% propulsion and 10% net saving remove 80 tonnes and leave 920 tonnes before switching. The 200 tonnes attributed to non-propulsion demand remain.</w:t>
+      </w:r>
+    </w:p>
+    <w:p>
+      <w:r>
+        <w:t>Savings are entered separately by voyage, fuel and sea category. Berth rows receive no wind saving; shore power remains a separate choice. The net estimate must already reconcile equipment auxiliary consumption in the physical fuel inputs. Separate additional auxiliary-fuel streams are not generated, so a retrofit that changes consumer or fuel mix requires a separately reconciled consumption assessment. A gross sail-saving estimate is insufficient. Confirm that the estimate also remains valid for the nominated alternative fuel system and its pilot and efficiency assumptions.</w:t>
+      </w:r>
+    </w:p>
+    <w:p>
+      <w:pPr>
+        <w:pStyle w:val="Heading2"/>
+      </w:pPr>
+      <w:r>
+        <w:t>12.3 Enter installation costs and technical evidence</w:t>
+      </w:r>
+    </w:p>
+    <w:p>
+      <w:r>
+        <w:t>Wind installation &amp; downtime cost is the complete new retrofit investment in EUR. If the installation is selected, this amount is charged once at the start of the horizon. The model assumes the retrofit operates throughout that horizon; it does not schedule delayed or mid-year commissioning. Existing capital is treated as sunk and must not be entered again.</w:t>
+      </w:r>
+    </w:p>
+    <w:p>
+      <w:r>
+        <w:t>Wind annual maintenance &amp; operating cost is the additional yearly equipment cost in EUR. Do not duplicate auxiliary fuel or electricity costs already included in the net-savings estimate, or costs recorded elsewhere. The full fixed cost applies when wind is active; it is not scaled down by the alternative-fuel share.</w:t>
+      </w:r>
+    </w:p>
+    <w:p>
+      <w:r>
+        <w:t>Confirm the wind baseline, compatibility, net performance and cost review, and enter the Wind technical &amp; baseline reference. Record the wing type, route/weather/speed basis, propulsion shares, auxiliary demand, engine and pilot limits, structural or operational constraints and investment evidence. The field records your review; it does not grant class approval or verify supplier performance.</w:t>
+      </w:r>
+    </w:p>
+    <w:p>
+      <w:pPr>
+        <w:pStyle w:val="Heading2"/>
+      </w:pPr>
+      <w:r>
+        <w:t>12.4 Review the separate FuelEU wind reward</w:t>
+      </w:r>
+    </w:p>
+    <w:p>
+      <w:r>
+        <w:t>Apply the separately reviewed FuelEU wind reward only with the supporting power assessment. Available effective wind power Pwind and EEDI/EEXI propulsion power Pprop are entered in kW. Use the prescribed technical-file definitions, including relevant shaft motors in Pprop, rather than an unreviewed engine nameplate rating. Record the EEDI/EEXI technical file or recognised-body assessment following MEPC.1/Circ.896 in the FuelEU wind-power evidence reference.</w:t>
+      </w:r>
+    </w:p>
+    <w:p>
+      <w:pPr>
+        <w:pStyle w:val="ListBullet"/>
+      </w:pPr>
+      <w:r>
+        <w:t>Pwind/Pprop below 0.05: multiplier 1.00, with no intensity reward.</w:t>
+      </w:r>
+    </w:p>
+    <w:p>
+      <w:pPr>
+        <w:pStyle w:val="ListBullet"/>
+      </w:pPr>
+      <w:r>
+        <w:t>Pwind/Pprop at least 0.05 and below 0.10: multiplier 0.99.</w:t>
+      </w:r>
+    </w:p>
+    <w:p>
+      <w:pPr>
+        <w:pStyle w:val="ListBullet"/>
+      </w:pPr>
+      <w:r>
+        <w:t>Pwind/Pprop at least 0.10 and below 0.15: multiplier 0.97.</w:t>
+      </w:r>
+    </w:p>
+    <w:p>
+      <w:pPr>
+        <w:pStyle w:val="ListBullet"/>
+      </w:pPr>
+      <w:r>
+        <w:t>Pwind/Pprop at least 0.15: multiplier 0.95.</w:t>
+      </w:r>
+    </w:p>
+    <w:p>
+      <w:r>
+        <w:t>The bands are discrete; the app does not round the ratio into a higher band or interpolate between bands. A forecast of 10% fuel savings does not establish a 10% power ratio. Physical savings and the FuelEU reward are separate inputs. With the reward unchecked, the multiplier is 1.00 even if wind fuel savings are selected.</w:t>
+      </w:r>
+    </w:p>
+    <w:p>
+      <w:r>
+        <w:t>The multiplier applies to the ship's annual FuelEU intensity after fuel, shore-power and RFNBO accounting. It does not add wind MJ to the energy denominator, change fuel emission factors or provide an additional ETS reduction. For example, an intensity of 90 gCO2e/MJ before the wind reward becomes 87.3 with a 0.97 multiplier. The compliance balance then uses that attained intensity and the covered physical energy. Existing wings apply their reviewed reward in the reference as well as the other strategies. Vessels outside FuelEU receive no FuelEU reward.</w:t>
+      </w:r>
+    </w:p>
+    <w:p>
+      <w:pPr>
+        <w:pStyle w:val="Heading2"/>
+      </w:pPr>
+      <w:r>
+        <w:t>12.5 Read the combined recommendation</w:t>
+      </w:r>
+    </w:p>
+    <w:p>
+      <w:r>
+        <w:t>Wind can be selected with the nominated alternative fuel, shore power and pooling. Fuel replacement fractions apply to the demand remaining after wind on each leg. The aggregate replacement limit and search weights retain the original sea-demand basis, giving a conservative service-share cap. Full equipment cost, fuel purchases, ETS, FuelEU balances, banking, shared supply and pooling needs are recalculated for each evaluated combination.</w:t>
+      </w:r>
+    </w:p>
+    <w:p>
+      <w:r>
+        <w:t>The report's What the package changes section compares discounted fuel, ETS, FuelEU penalties, pooling, electricity and implementation costs against the reference. Positive amounts are savings; negative amounts are additional costs. The differences reconcile to the total net saving. Wind equipment cost is already included in implementation cost and must not be added again. These are combined-strategy effects, not independent technology savings to be summed together.</w:t>
+      </w:r>
+    </w:p>
+    <w:p>
+      <w:r>
+        <w:t>The annual wind ledger shows equipment cost, current fuel avoided before switching, intensity before the wind reward, the multiplier, attained intensity and the raw FuelEU balance. Expand Fuel changes by voyage leg to reconcile original tonnes minus net wind reduction minus fuel switched with current fuel retained. Alternative fuel and its pilot are separately shown in the normal fuel recommendation and ledger.</w:t>
+      </w:r>
+    </w:p>
+    <w:p>
+      <w:pPr>
+        <w:pStyle w:val="Heading2"/>
+      </w:pPr>
+      <w:r>
+        <w:t>12.6 Imports, records and modelling limits</w:t>
+      </w:r>
+    </w:p>
+    <w:p>
+      <w:r>
+        <w:t>Existing Excel and CSV fleet templates remain compatible. Imported vessels start with no wind assumption or reward. Open each imported vessel to review the wind settings and the two sea-row percentages; consumption alone is not evidence of a wind installation. CSV reports include wind fields and leg reconciliation, and JSON retains the complete inputs, results and evidence references. Older saved reports are not recalculated or rewritten.</w:t>
+      </w:r>
+    </w:p>
+    <w:p>
+      <w:r>
+        <w:t>Annual wind performance and the selected equipment remain fixed over the horizon. The model does not predict aerodynamics, route weather, installation timing, changing engine efficiency or methane slip at reduced loads. Use separately reviewed performance cases for low, central and high savings assumptions, and obtain the relevant technical and verifier assessments before relying on a prospective installation. The bounded optimizer still does not guarantee a global fleet optimum or search every possible pool subset.</w:t>
+      </w:r>
+    </w:p>
+    <w:p>
+      <w:r>
+        <w:t>Wind accounting is based on Annex I of Regulation (EU) 2023/1805 and Commission guidance section 4.5, Table 4.12. Wind sources were reviewed on 16 September 2026; the other rule interpretations are inherited from the preceding release. Further worked equations and the detailed technical contract are in docs/WIND_ASSISTANCE.md in the project repository.</w:t>
+      </w:r>
+    </w:p>
+    <w:p>
+      <w:pPr>
+        <w:pStyle w:val="Heading1"/>
+      </w:pPr>
+      <w:r>
+        <w:t>13. References and version control</w:t>
+      </w:r>
+    </w:p>
+    <w:p>
+      <w:pPr>
+        <w:pStyle w:val="ListBullet"/>
+      </w:pPr>
+      <w:r>
+        <w:rPr>
+          <w:sz w:val="16"/>
+        </w:rPr>
+        <w:t>Commission wind-assisted propulsion guidance: https://transport.ec.europa.eu/document/download/d4426ccc-ef46-4292-8b6d-5bf7a620f5ba_en?filename=fueleu_guidance_document_for_shipping_companies.pdf#page=53 (section 4.5, pages 53–54; Table 4.12 and Annex I of Regulation (EU) 2023/1805).</w:t>
       </w:r>
     </w:p>
     <w:p>
@@ -1500,7 +1692,7 @@
     </w:p>
     <w:p>
       <w:r>
-        <w:t>The following sources were consulted for the regulatory context. The guide's descriptions of field behavior, search limits, accounting sequence and exports are based on the application's engine 6.7.0, forms and release tests. Regulatory changes after the recorded ruleset date require review before use; the guide does not assert a new legal ruleset.</w:t>
+        <w:t>The following sources were consulted for the regulatory context. The guide's descriptions of field behavior, search limits, accounting sequence and exports are based on the application's engine 6.8.0, forms and release tests. Regulatory changes after the recorded ruleset date require review before use; the guide does not assert a new legal ruleset.</w:t>
       </w:r>
     </w:p>
     <w:p>
@@ -1580,7 +1772,7 @@
       <w:jc w:val="right"/>
     </w:pPr>
     <w:r>
-      <w:t xml:space="preserve">Review draft · Engine 6.7.0  |  </w:t>
+      <w:t xml:space="preserve">Review draft · Engine 6.8.0  |  </w:t>
     </w:r>
     <w:fldSimple w:instr="PAGE"/>
   </w:p>

</xml_diff>